<commit_message>
Re-measure five suspect Equal/Adaptive cells; add diagnostics to tables and text
Co-Authored-By: Claude Sonnet 5.5 <noreply@anthropic.com>
Claude-Session: https://claude.ai/code/session_01T6gEewJ8YaCdmnsfS34RJd
</commit_message>
<xml_diff>
--- a/results/CH4_TABLES.docx
+++ b/results/CH4_TABLES.docx
@@ -7563,9 +7563,597 @@
           <w:b w:val="0"/>
           <w:i w:val="0"/>
         </w:rPr>
-        <w:t>An earlier measurement session, which recorded only the LBG time, gave mean LBG gains of 28.5%, 24.1%, 20.6%, and 17.7% at P = 8, 10, 12, and 14, which differs from the values above by at most 1.2 percentage points. In 5 image–process combinations (Peppers at P = 8, Chest X-ray at P = 14, Mammogram at P = 14, Lung CT at P = 12, Lung CT at P = 14), the Adaptive LBG time was more than 2 percentage points less favorable than in the earlier session. The cause was not investigated.</w:t>
+        <w:t xml:space="preserve">An earlier measurement session, which recorded only the LBG time, gave mean LBG gains of 28.5%, 24.1%, 20.6%, and 17.7% at P = 8, 10, 12, and 14, which differs from the values above by at most 1.2 percentage points. In 5 image–process combinations (Peppers at P = 8, Chest X-ray at P = 14, Mammogram at P = 14, Lung CT at P = 12, Lung CT at P = 14), the Adaptive LBG time was more than 2 percentage points less favorable than in the earlier session. </w:t>
       </w:r>
     </w:p>
+    <w:p>
+      <w:r>
+        <w:rPr>
+          <w:b w:val="0"/>
+          <w:i w:val="0"/>
+        </w:rPr>
+        <w:t>These five combinations were measured again, with ten alternated runs each and with the calibrated rank speeds recorded (Table 4.15). The re-measured Adaptive times agreed with the earlier session and not with the main campaign, so the main-campaign values for these cells were affected by a disturbance that did not recur. The Equal times were the same in all three measurements. The calibration was not the cause. In the 50 repeated Adaptive runs, one E-core rank was calibrated 4% to 6% below the others in three runs. Only one of these three runs was slower than the median of its cell (by 3.5%), and the slowest run among the remaining ones (10% above its cell median) had normal calibration values. Replacing the five cells by the re-measured values would change the mean LBG gain from 28.4% to 28.6% at P = 8, from 20.1% to 20.6% at P = 12, and from 16.6% to 17.8% at P = 14. The main-campaign values are retained in Tables 4.12 to 4.14 as measured. The re-measured values are given for reference only.</w:t>
+      </w:r>
+    </w:p>
+    <w:p>
+      <w:r>
+        <w:rPr>
+          <w:b/>
+        </w:rPr>
+        <w:t>Table 4.15. Re-measurement of the five image–process combinations with the least favorable Adaptive result (LBG time, s).</w:t>
+      </w:r>
+    </w:p>
+    <w:tbl>
+      <w:tblPr>
+        <w:tblStyle w:val="TableGrid"/>
+        <w:tblW w:type="auto" w:w="0"/>
+        <w:tblLook w:firstColumn="1" w:firstRow="1" w:lastColumn="0" w:lastRow="0" w:noHBand="0" w:noVBand="1" w:val="04A0"/>
+      </w:tblPr>
+      <w:tblGrid>
+        <w:gridCol w:w="960"/>
+        <w:gridCol w:w="960"/>
+        <w:gridCol w:w="960"/>
+        <w:gridCol w:w="960"/>
+        <w:gridCol w:w="960"/>
+        <w:gridCol w:w="960"/>
+        <w:gridCol w:w="960"/>
+        <w:gridCol w:w="960"/>
+        <w:gridCol w:w="960"/>
+      </w:tblGrid>
+      <w:tr>
+        <w:tc>
+          <w:tcPr>
+            <w:tcW w:type="dxa" w:w="960"/>
+          </w:tcPr>
+          <w:p>
+            <w:r>
+              <w:t>Image</w:t>
+            </w:r>
+          </w:p>
+        </w:tc>
+        <w:tc>
+          <w:tcPr>
+            <w:tcW w:type="dxa" w:w="960"/>
+          </w:tcPr>
+          <w:p>
+            <w:r>
+              <w:t>P</w:t>
+            </w:r>
+          </w:p>
+        </w:tc>
+        <w:tc>
+          <w:tcPr>
+            <w:tcW w:type="dxa" w:w="960"/>
+          </w:tcPr>
+          <w:p>
+            <w:r>
+              <w:t>Equal (10 runs)</w:t>
+            </w:r>
+          </w:p>
+        </w:tc>
+        <w:tc>
+          <w:tcPr>
+            <w:tcW w:type="dxa" w:w="960"/>
+          </w:tcPr>
+          <w:p>
+            <w:r>
+              <w:t>Adaptive (10 runs)</w:t>
+            </w:r>
+          </w:p>
+        </w:tc>
+        <w:tc>
+          <w:tcPr>
+            <w:tcW w:type="dxa" w:w="960"/>
+          </w:tcPr>
+          <w:p>
+            <w:r>
+              <w:t>Gain (%)</w:t>
+            </w:r>
+          </w:p>
+        </w:tc>
+        <w:tc>
+          <w:tcPr>
+            <w:tcW w:type="dxa" w:w="960"/>
+          </w:tcPr>
+          <w:p>
+            <w:r>
+              <w:t>Adaptive (main campaign)</w:t>
+            </w:r>
+          </w:p>
+        </w:tc>
+        <w:tc>
+          <w:tcPr>
+            <w:tcW w:type="dxa" w:w="960"/>
+          </w:tcPr>
+          <w:p>
+            <w:r>
+              <w:t>Gain (%)</w:t>
+            </w:r>
+          </w:p>
+        </w:tc>
+        <w:tc>
+          <w:tcPr>
+            <w:tcW w:type="dxa" w:w="960"/>
+          </w:tcPr>
+          <w:p>
+            <w:r>
+              <w:t>Adaptive (earlier session)</w:t>
+            </w:r>
+          </w:p>
+        </w:tc>
+        <w:tc>
+          <w:tcPr>
+            <w:tcW w:type="dxa" w:w="960"/>
+          </w:tcPr>
+          <w:p>
+            <w:r>
+              <w:t>Gain (%)</w:t>
+            </w:r>
+          </w:p>
+        </w:tc>
+      </w:tr>
+      <w:tr>
+        <w:tc>
+          <w:tcPr>
+            <w:tcW w:type="dxa" w:w="960"/>
+          </w:tcPr>
+          <w:p>
+            <w:r>
+              <w:t>Lung CT</w:t>
+            </w:r>
+          </w:p>
+        </w:tc>
+        <w:tc>
+          <w:tcPr>
+            <w:tcW w:type="dxa" w:w="960"/>
+          </w:tcPr>
+          <w:p>
+            <w:r>
+              <w:t>12</w:t>
+            </w:r>
+          </w:p>
+        </w:tc>
+        <w:tc>
+          <w:tcPr>
+            <w:tcW w:type="dxa" w:w="960"/>
+          </w:tcPr>
+          <w:p>
+            <w:r>
+              <w:t>0.0448</w:t>
+            </w:r>
+          </w:p>
+        </w:tc>
+        <w:tc>
+          <w:tcPr>
+            <w:tcW w:type="dxa" w:w="960"/>
+          </w:tcPr>
+          <w:p>
+            <w:r>
+              <w:t>0.0355</w:t>
+            </w:r>
+          </w:p>
+        </w:tc>
+        <w:tc>
+          <w:tcPr>
+            <w:tcW w:type="dxa" w:w="960"/>
+          </w:tcPr>
+          <w:p>
+            <w:r>
+              <w:t>20.8</w:t>
+            </w:r>
+          </w:p>
+        </w:tc>
+        <w:tc>
+          <w:tcPr>
+            <w:tcW w:type="dxa" w:w="960"/>
+          </w:tcPr>
+          <w:p>
+            <w:r>
+              <w:t>0.0378</w:t>
+            </w:r>
+          </w:p>
+        </w:tc>
+        <w:tc>
+          <w:tcPr>
+            <w:tcW w:type="dxa" w:w="960"/>
+          </w:tcPr>
+          <w:p>
+            <w:r>
+              <w:t>15.6</w:t>
+            </w:r>
+          </w:p>
+        </w:tc>
+        <w:tc>
+          <w:tcPr>
+            <w:tcW w:type="dxa" w:w="960"/>
+          </w:tcPr>
+          <w:p>
+            <w:r>
+              <w:t>0.0354</w:t>
+            </w:r>
+          </w:p>
+        </w:tc>
+        <w:tc>
+          <w:tcPr>
+            <w:tcW w:type="dxa" w:w="960"/>
+          </w:tcPr>
+          <w:p>
+            <w:r>
+              <w:t>20.6</w:t>
+            </w:r>
+          </w:p>
+        </w:tc>
+      </w:tr>
+      <w:tr>
+        <w:tc>
+          <w:tcPr>
+            <w:tcW w:type="dxa" w:w="960"/>
+          </w:tcPr>
+          <w:p>
+            <w:r>
+              <w:t>Lung CT</w:t>
+            </w:r>
+          </w:p>
+        </w:tc>
+        <w:tc>
+          <w:tcPr>
+            <w:tcW w:type="dxa" w:w="960"/>
+          </w:tcPr>
+          <w:p>
+            <w:r>
+              <w:t>14</w:t>
+            </w:r>
+          </w:p>
+        </w:tc>
+        <w:tc>
+          <w:tcPr>
+            <w:tcW w:type="dxa" w:w="960"/>
+          </w:tcPr>
+          <w:p>
+            <w:r>
+              <w:t>0.0388</w:t>
+            </w:r>
+          </w:p>
+        </w:tc>
+        <w:tc>
+          <w:tcPr>
+            <w:tcW w:type="dxa" w:w="960"/>
+          </w:tcPr>
+          <w:p>
+            <w:r>
+              <w:t>0.0318</w:t>
+            </w:r>
+          </w:p>
+        </w:tc>
+        <w:tc>
+          <w:tcPr>
+            <w:tcW w:type="dxa" w:w="960"/>
+          </w:tcPr>
+          <w:p>
+            <w:r>
+              <w:t>18.0</w:t>
+            </w:r>
+          </w:p>
+        </w:tc>
+        <w:tc>
+          <w:tcPr>
+            <w:tcW w:type="dxa" w:w="960"/>
+          </w:tcPr>
+          <w:p>
+            <w:r>
+              <w:t>0.0337</w:t>
+            </w:r>
+          </w:p>
+        </w:tc>
+        <w:tc>
+          <w:tcPr>
+            <w:tcW w:type="dxa" w:w="960"/>
+          </w:tcPr>
+          <w:p>
+            <w:r>
+              <w:t>12.9</w:t>
+            </w:r>
+          </w:p>
+        </w:tc>
+        <w:tc>
+          <w:tcPr>
+            <w:tcW w:type="dxa" w:w="960"/>
+          </w:tcPr>
+          <w:p>
+            <w:r>
+              <w:t>0.0317</w:t>
+            </w:r>
+          </w:p>
+        </w:tc>
+        <w:tc>
+          <w:tcPr>
+            <w:tcW w:type="dxa" w:w="960"/>
+          </w:tcPr>
+          <w:p>
+            <w:r>
+              <w:t>18.1</w:t>
+            </w:r>
+          </w:p>
+        </w:tc>
+      </w:tr>
+      <w:tr>
+        <w:tc>
+          <w:tcPr>
+            <w:tcW w:type="dxa" w:w="960"/>
+          </w:tcPr>
+          <w:p>
+            <w:r>
+              <w:t>Chest X-ray</w:t>
+            </w:r>
+          </w:p>
+        </w:tc>
+        <w:tc>
+          <w:tcPr>
+            <w:tcW w:type="dxa" w:w="960"/>
+          </w:tcPr>
+          <w:p>
+            <w:r>
+              <w:t>14</w:t>
+            </w:r>
+          </w:p>
+        </w:tc>
+        <w:tc>
+          <w:tcPr>
+            <w:tcW w:type="dxa" w:w="960"/>
+          </w:tcPr>
+          <w:p>
+            <w:r>
+              <w:t>0.0313</w:t>
+            </w:r>
+          </w:p>
+        </w:tc>
+        <w:tc>
+          <w:tcPr>
+            <w:tcW w:type="dxa" w:w="960"/>
+          </w:tcPr>
+          <w:p>
+            <w:r>
+              <w:t>0.0256</w:t>
+            </w:r>
+          </w:p>
+        </w:tc>
+        <w:tc>
+          <w:tcPr>
+            <w:tcW w:type="dxa" w:w="960"/>
+          </w:tcPr>
+          <w:p>
+            <w:r>
+              <w:t>18.2</w:t>
+            </w:r>
+          </w:p>
+        </w:tc>
+        <w:tc>
+          <w:tcPr>
+            <w:tcW w:type="dxa" w:w="960"/>
+          </w:tcPr>
+          <w:p>
+            <w:r>
+              <w:t>0.0274</w:t>
+            </w:r>
+          </w:p>
+        </w:tc>
+        <w:tc>
+          <w:tcPr>
+            <w:tcW w:type="dxa" w:w="960"/>
+          </w:tcPr>
+          <w:p>
+            <w:r>
+              <w:t>12.2</w:t>
+            </w:r>
+          </w:p>
+        </w:tc>
+        <w:tc>
+          <w:tcPr>
+            <w:tcW w:type="dxa" w:w="960"/>
+          </w:tcPr>
+          <w:p>
+            <w:r>
+              <w:t>0.0256</w:t>
+            </w:r>
+          </w:p>
+        </w:tc>
+        <w:tc>
+          <w:tcPr>
+            <w:tcW w:type="dxa" w:w="960"/>
+          </w:tcPr>
+          <w:p>
+            <w:r>
+              <w:t>17.9</w:t>
+            </w:r>
+          </w:p>
+        </w:tc>
+      </w:tr>
+      <w:tr>
+        <w:tc>
+          <w:tcPr>
+            <w:tcW w:type="dxa" w:w="960"/>
+          </w:tcPr>
+          <w:p>
+            <w:r>
+              <w:t>Mammogram</w:t>
+            </w:r>
+          </w:p>
+        </w:tc>
+        <w:tc>
+          <w:tcPr>
+            <w:tcW w:type="dxa" w:w="960"/>
+          </w:tcPr>
+          <w:p>
+            <w:r>
+              <w:t>14</w:t>
+            </w:r>
+          </w:p>
+        </w:tc>
+        <w:tc>
+          <w:tcPr>
+            <w:tcW w:type="dxa" w:w="960"/>
+          </w:tcPr>
+          <w:p>
+            <w:r>
+              <w:t>0.0278</w:t>
+            </w:r>
+          </w:p>
+        </w:tc>
+        <w:tc>
+          <w:tcPr>
+            <w:tcW w:type="dxa" w:w="960"/>
+          </w:tcPr>
+          <w:p>
+            <w:r>
+              <w:t>0.0228</w:t>
+            </w:r>
+          </w:p>
+        </w:tc>
+        <w:tc>
+          <w:tcPr>
+            <w:tcW w:type="dxa" w:w="960"/>
+          </w:tcPr>
+          <w:p>
+            <w:r>
+              <w:t>18.0</w:t>
+            </w:r>
+          </w:p>
+        </w:tc>
+        <w:tc>
+          <w:tcPr>
+            <w:tcW w:type="dxa" w:w="960"/>
+          </w:tcPr>
+          <w:p>
+            <w:r>
+              <w:t>0.0251</w:t>
+            </w:r>
+          </w:p>
+        </w:tc>
+        <w:tc>
+          <w:tcPr>
+            <w:tcW w:type="dxa" w:w="960"/>
+          </w:tcPr>
+          <w:p>
+            <w:r>
+              <w:t>14.3</w:t>
+            </w:r>
+          </w:p>
+        </w:tc>
+        <w:tc>
+          <w:tcPr>
+            <w:tcW w:type="dxa" w:w="960"/>
+          </w:tcPr>
+          <w:p>
+            <w:r>
+              <w:t>0.0227</w:t>
+            </w:r>
+          </w:p>
+        </w:tc>
+        <w:tc>
+          <w:tcPr>
+            <w:tcW w:type="dxa" w:w="960"/>
+          </w:tcPr>
+          <w:p>
+            <w:r>
+              <w:t>18.1</w:t>
+            </w:r>
+          </w:p>
+        </w:tc>
+      </w:tr>
+      <w:tr>
+        <w:tc>
+          <w:tcPr>
+            <w:tcW w:type="dxa" w:w="960"/>
+          </w:tcPr>
+          <w:p>
+            <w:r>
+              <w:t>Peppers</w:t>
+            </w:r>
+          </w:p>
+        </w:tc>
+        <w:tc>
+          <w:tcPr>
+            <w:tcW w:type="dxa" w:w="960"/>
+          </w:tcPr>
+          <w:p>
+            <w:r>
+              <w:t>8</w:t>
+            </w:r>
+          </w:p>
+        </w:tc>
+        <w:tc>
+          <w:tcPr>
+            <w:tcW w:type="dxa" w:w="960"/>
+          </w:tcPr>
+          <w:p>
+            <w:r>
+              <w:t>0.0625</w:t>
+            </w:r>
+          </w:p>
+        </w:tc>
+        <w:tc>
+          <w:tcPr>
+            <w:tcW w:type="dxa" w:w="960"/>
+          </w:tcPr>
+          <w:p>
+            <w:r>
+              <w:t>0.0445</w:t>
+            </w:r>
+          </w:p>
+        </w:tc>
+        <w:tc>
+          <w:tcPr>
+            <w:tcW w:type="dxa" w:w="960"/>
+          </w:tcPr>
+          <w:p>
+            <w:r>
+              <w:t>28.8</w:t>
+            </w:r>
+          </w:p>
+        </w:tc>
+        <w:tc>
+          <w:tcPr>
+            <w:tcW w:type="dxa" w:w="960"/>
+          </w:tcPr>
+          <w:p>
+            <w:r>
+              <w:t>0.0461</w:t>
+            </w:r>
+          </w:p>
+        </w:tc>
+        <w:tc>
+          <w:tcPr>
+            <w:tcW w:type="dxa" w:w="960"/>
+          </w:tcPr>
+          <w:p>
+            <w:r>
+              <w:t>26.1</w:t>
+            </w:r>
+          </w:p>
+        </w:tc>
+        <w:tc>
+          <w:tcPr>
+            <w:tcW w:type="dxa" w:w="960"/>
+          </w:tcPr>
+          <w:p>
+            <w:r>
+              <w:t>0.0446</w:t>
+            </w:r>
+          </w:p>
+        </w:tc>
+        <w:tc>
+          <w:tcPr>
+            <w:tcW w:type="dxa" w:w="960"/>
+          </w:tcPr>
+          <w:p>
+            <w:r>
+              <w:t>28.8</w:t>
+            </w:r>
+          </w:p>
+        </w:tc>
+      </w:tr>
+    </w:tbl>
+    <w:p/>
     <w:p>
       <w:pPr>
         <w:pStyle w:val="Heading2"/>
@@ -7579,7 +8167,7 @@
         <w:rPr>
           <w:b/>
         </w:rPr>
-        <w:t>Table 4.15 (optional). Mean LBG throughput (million vector assignments per second).</w:t>
+        <w:t>Table 4.16 (optional). Mean LBG throughput (million vector assignments per second).</w:t>
       </w:r>
     </w:p>
     <w:tbl>

</xml_diff>

<commit_message>
Add entropy results (grayscale) to tables
Co-Authored-By: Claude Sonnet 5.5 <noreply@anthropic.com>
Claude-Session: https://claude.ai/code/session_01T6gEewJ8YaCdmnsfS34RJd
</commit_message>
<xml_diff>
--- a/results/CH4_TABLES.docx
+++ b/results/CH4_TABLES.docx
@@ -8465,6 +8465,696 @@
           <w:p>
             <w:r>
               <w:t>97.88</w:t>
+            </w:r>
+          </w:p>
+        </w:tc>
+      </w:tr>
+    </w:tbl>
+    <w:p/>
+    <w:p>
+      <w:pPr>
+        <w:pStyle w:val="Heading2"/>
+      </w:pPr>
+      <w:r>
+        <w:t>Entropy paragraph (for Section 4.3, grayscale images)</w:t>
+      </w:r>
+    </w:p>
+    <w:p>
+      <w:r>
+        <w:rPr>
+          <w:b w:val="0"/>
+          <w:i w:val="0"/>
+        </w:rPr>
+        <w:t>Table 4.17 gives the entropy of the VQ index stream of the grayscale images before and after delta coding, together with the average length of the Huffman code that was produced. Delta coding lowered the entropy for every image, from 0.19 bit per index for Lung CT to 2.13 bits per index for Mammogram. The Huffman code length was 0.014 to 0.069 bit above the entropy after delta coding. Compared with a fixed-length index of 6 bits (K = 64), the delta and Huffman stages reduced the size of the index stream by 20.9% for Chest X-ray to 48.6% for Brain MRI. The images had the same order by compression ratio and by the entropy after delta coding: the lower the entropy, the higher the compression ratio. The codebook size and the number of indices were the same for all images. The differences in compression ratio therefore came from the size of the Huffman-coded index stream. The entropy was measured for the grayscale images only, because the color pipeline of the program does not compute it.</w:t>
+      </w:r>
+    </w:p>
+    <w:p>
+      <w:r>
+        <w:rPr>
+          <w:b/>
+        </w:rPr>
+        <w:t>Table 4.17. Entropy of the VQ index stream and Huffman code length of the grayscale images (bits per index).</w:t>
+      </w:r>
+    </w:p>
+    <w:tbl>
+      <w:tblPr>
+        <w:tblStyle w:val="TableGrid"/>
+        <w:tblW w:type="auto" w:w="0"/>
+        <w:tblLook w:firstColumn="1" w:firstRow="1" w:lastColumn="0" w:lastRow="0" w:noHBand="0" w:noVBand="1" w:val="04A0"/>
+      </w:tblPr>
+      <w:tblGrid>
+        <w:gridCol w:w="1234"/>
+        <w:gridCol w:w="1234"/>
+        <w:gridCol w:w="1234"/>
+        <w:gridCol w:w="1234"/>
+        <w:gridCol w:w="1234"/>
+        <w:gridCol w:w="1234"/>
+        <w:gridCol w:w="1234"/>
+      </w:tblGrid>
+      <w:tr>
+        <w:tc>
+          <w:tcPr>
+            <w:tcW w:type="dxa" w:w="1234"/>
+          </w:tcPr>
+          <w:p>
+            <w:r>
+              <w:t>Image</w:t>
+            </w:r>
+          </w:p>
+        </w:tc>
+        <w:tc>
+          <w:tcPr>
+            <w:tcW w:type="dxa" w:w="1234"/>
+          </w:tcPr>
+          <w:p>
+            <w:r>
+              <w:t>Entropy before delta</w:t>
+            </w:r>
+          </w:p>
+        </w:tc>
+        <w:tc>
+          <w:tcPr>
+            <w:tcW w:type="dxa" w:w="1234"/>
+          </w:tcPr>
+          <w:p>
+            <w:r>
+              <w:t>Entropy after delta</w:t>
+            </w:r>
+          </w:p>
+        </w:tc>
+        <w:tc>
+          <w:tcPr>
+            <w:tcW w:type="dxa" w:w="1234"/>
+          </w:tcPr>
+          <w:p>
+            <w:r>
+              <w:t>Reduction by delta</w:t>
+            </w:r>
+          </w:p>
+        </w:tc>
+        <w:tc>
+          <w:tcPr>
+            <w:tcW w:type="dxa" w:w="1234"/>
+          </w:tcPr>
+          <w:p>
+            <w:r>
+              <w:t>Huffman code length</w:t>
+            </w:r>
+          </w:p>
+        </w:tc>
+        <w:tc>
+          <w:tcPr>
+            <w:tcW w:type="dxa" w:w="1234"/>
+          </w:tcPr>
+          <w:p>
+            <w:r>
+              <w:t>Saving vs 6-bit indices (%)</w:t>
+            </w:r>
+          </w:p>
+        </w:tc>
+        <w:tc>
+          <w:tcPr>
+            <w:tcW w:type="dxa" w:w="1234"/>
+          </w:tcPr>
+          <w:p>
+            <w:r>
+              <w:t>CR (×)</w:t>
+            </w:r>
+          </w:p>
+        </w:tc>
+      </w:tr>
+      <w:tr>
+        <w:tc>
+          <w:tcPr>
+            <w:tcW w:type="dxa" w:w="1234"/>
+          </w:tcPr>
+          <w:p>
+            <w:r>
+              <w:t>Lena</w:t>
+            </w:r>
+          </w:p>
+        </w:tc>
+        <w:tc>
+          <w:tcPr>
+            <w:tcW w:type="dxa" w:w="1234"/>
+          </w:tcPr>
+          <w:p>
+            <w:r>
+              <w:t>5.393</w:t>
+            </w:r>
+          </w:p>
+        </w:tc>
+        <w:tc>
+          <w:tcPr>
+            <w:tcW w:type="dxa" w:w="1234"/>
+          </w:tcPr>
+          <w:p>
+            <w:r>
+              <w:t>4.665</w:t>
+            </w:r>
+          </w:p>
+        </w:tc>
+        <w:tc>
+          <w:tcPr>
+            <w:tcW w:type="dxa" w:w="1234"/>
+          </w:tcPr>
+          <w:p>
+            <w:r>
+              <w:t>0.728</w:t>
+            </w:r>
+          </w:p>
+        </w:tc>
+        <w:tc>
+          <w:tcPr>
+            <w:tcW w:type="dxa" w:w="1234"/>
+          </w:tcPr>
+          <w:p>
+            <w:r>
+              <w:t>4.711</w:t>
+            </w:r>
+          </w:p>
+        </w:tc>
+        <w:tc>
+          <w:tcPr>
+            <w:tcW w:type="dxa" w:w="1234"/>
+          </w:tcPr>
+          <w:p>
+            <w:r>
+              <w:t>21.5</w:t>
+            </w:r>
+          </w:p>
+        </w:tc>
+        <w:tc>
+          <w:tcPr>
+            <w:tcW w:type="dxa" w:w="1234"/>
+          </w:tcPr>
+          <w:p>
+            <w:r>
+              <w:t>23.50</w:t>
+            </w:r>
+          </w:p>
+        </w:tc>
+      </w:tr>
+      <w:tr>
+        <w:tc>
+          <w:tcPr>
+            <w:tcW w:type="dxa" w:w="1234"/>
+          </w:tcPr>
+          <w:p>
+            <w:r>
+              <w:t>Boat</w:t>
+            </w:r>
+          </w:p>
+        </w:tc>
+        <w:tc>
+          <w:tcPr>
+            <w:tcW w:type="dxa" w:w="1234"/>
+          </w:tcPr>
+          <w:p>
+            <w:r>
+              <w:t>5.237</w:t>
+            </w:r>
+          </w:p>
+        </w:tc>
+        <w:tc>
+          <w:tcPr>
+            <w:tcW w:type="dxa" w:w="1234"/>
+          </w:tcPr>
+          <w:p>
+            <w:r>
+              <w:t>4.061</w:t>
+            </w:r>
+          </w:p>
+        </w:tc>
+        <w:tc>
+          <w:tcPr>
+            <w:tcW w:type="dxa" w:w="1234"/>
+          </w:tcPr>
+          <w:p>
+            <w:r>
+              <w:t>1.176</w:t>
+            </w:r>
+          </w:p>
+        </w:tc>
+        <w:tc>
+          <w:tcPr>
+            <w:tcW w:type="dxa" w:w="1234"/>
+          </w:tcPr>
+          <w:p>
+            <w:r>
+              <w:t>4.082</w:t>
+            </w:r>
+          </w:p>
+        </w:tc>
+        <w:tc>
+          <w:tcPr>
+            <w:tcW w:type="dxa" w:w="1234"/>
+          </w:tcPr>
+          <w:p>
+            <w:r>
+              <w:t>32.0</w:t>
+            </w:r>
+          </w:p>
+        </w:tc>
+        <w:tc>
+          <w:tcPr>
+            <w:tcW w:type="dxa" w:w="1234"/>
+          </w:tcPr>
+          <w:p>
+            <w:r>
+              <w:t>26.54</w:t>
+            </w:r>
+          </w:p>
+        </w:tc>
+      </w:tr>
+      <w:tr>
+        <w:tc>
+          <w:tcPr>
+            <w:tcW w:type="dxa" w:w="1234"/>
+          </w:tcPr>
+          <w:p>
+            <w:r>
+              <w:t>Cameraman</w:t>
+            </w:r>
+          </w:p>
+        </w:tc>
+        <w:tc>
+          <w:tcPr>
+            <w:tcW w:type="dxa" w:w="1234"/>
+          </w:tcPr>
+          <w:p>
+            <w:r>
+              <w:t>5.165</w:t>
+            </w:r>
+          </w:p>
+        </w:tc>
+        <w:tc>
+          <w:tcPr>
+            <w:tcW w:type="dxa" w:w="1234"/>
+          </w:tcPr>
+          <w:p>
+            <w:r>
+              <w:t>3.682</w:t>
+            </w:r>
+          </w:p>
+        </w:tc>
+        <w:tc>
+          <w:tcPr>
+            <w:tcW w:type="dxa" w:w="1234"/>
+          </w:tcPr>
+          <w:p>
+            <w:r>
+              <w:t>1.483</w:t>
+            </w:r>
+          </w:p>
+        </w:tc>
+        <w:tc>
+          <w:tcPr>
+            <w:tcW w:type="dxa" w:w="1234"/>
+          </w:tcPr>
+          <w:p>
+            <w:r>
+              <w:t>3.703</w:t>
+            </w:r>
+          </w:p>
+        </w:tc>
+        <w:tc>
+          <w:tcPr>
+            <w:tcW w:type="dxa" w:w="1234"/>
+          </w:tcPr>
+          <w:p>
+            <w:r>
+              <w:t>38.3</w:t>
+            </w:r>
+          </w:p>
+        </w:tc>
+        <w:tc>
+          <w:tcPr>
+            <w:tcW w:type="dxa" w:w="1234"/>
+          </w:tcPr>
+          <w:p>
+            <w:r>
+              <w:t>28.88</w:t>
+            </w:r>
+          </w:p>
+        </w:tc>
+      </w:tr>
+      <w:tr>
+        <w:tc>
+          <w:tcPr>
+            <w:tcW w:type="dxa" w:w="1234"/>
+          </w:tcPr>
+          <w:p>
+            <w:r>
+              <w:t>Peppers</w:t>
+            </w:r>
+          </w:p>
+        </w:tc>
+        <w:tc>
+          <w:tcPr>
+            <w:tcW w:type="dxa" w:w="1234"/>
+          </w:tcPr>
+          <w:p>
+            <w:r>
+              <w:t>5.396</w:t>
+            </w:r>
+          </w:p>
+        </w:tc>
+        <w:tc>
+          <w:tcPr>
+            <w:tcW w:type="dxa" w:w="1234"/>
+          </w:tcPr>
+          <w:p>
+            <w:r>
+              <w:t>4.365</w:t>
+            </w:r>
+          </w:p>
+        </w:tc>
+        <w:tc>
+          <w:tcPr>
+            <w:tcW w:type="dxa" w:w="1234"/>
+          </w:tcPr>
+          <w:p>
+            <w:r>
+              <w:t>1.031</w:t>
+            </w:r>
+          </w:p>
+        </w:tc>
+        <w:tc>
+          <w:tcPr>
+            <w:tcW w:type="dxa" w:w="1234"/>
+          </w:tcPr>
+          <w:p>
+            <w:r>
+              <w:t>4.433</w:t>
+            </w:r>
+          </w:p>
+        </w:tc>
+        <w:tc>
+          <w:tcPr>
+            <w:tcW w:type="dxa" w:w="1234"/>
+          </w:tcPr>
+          <w:p>
+            <w:r>
+              <w:t>26.1</w:t>
+            </w:r>
+          </w:p>
+        </w:tc>
+        <w:tc>
+          <w:tcPr>
+            <w:tcW w:type="dxa" w:w="1234"/>
+          </w:tcPr>
+          <w:p>
+            <w:r>
+              <w:t>24.75</w:t>
+            </w:r>
+          </w:p>
+        </w:tc>
+      </w:tr>
+      <w:tr>
+        <w:tc>
+          <w:tcPr>
+            <w:tcW w:type="dxa" w:w="1234"/>
+          </w:tcPr>
+          <w:p>
+            <w:r>
+              <w:t>Chest X-ray</w:t>
+            </w:r>
+          </w:p>
+        </w:tc>
+        <w:tc>
+          <w:tcPr>
+            <w:tcW w:type="dxa" w:w="1234"/>
+          </w:tcPr>
+          <w:p>
+            <w:r>
+              <w:t>5.630</w:t>
+            </w:r>
+          </w:p>
+        </w:tc>
+        <w:tc>
+          <w:tcPr>
+            <w:tcW w:type="dxa" w:w="1234"/>
+          </w:tcPr>
+          <w:p>
+            <w:r>
+              <w:t>4.724</w:t>
+            </w:r>
+          </w:p>
+        </w:tc>
+        <w:tc>
+          <w:tcPr>
+            <w:tcW w:type="dxa" w:w="1234"/>
+          </w:tcPr>
+          <w:p>
+            <w:r>
+              <w:t>0.906</w:t>
+            </w:r>
+          </w:p>
+        </w:tc>
+        <w:tc>
+          <w:tcPr>
+            <w:tcW w:type="dxa" w:w="1234"/>
+          </w:tcPr>
+          <w:p>
+            <w:r>
+              <w:t>4.747</w:t>
+            </w:r>
+          </w:p>
+        </w:tc>
+        <w:tc>
+          <w:tcPr>
+            <w:tcW w:type="dxa" w:w="1234"/>
+          </w:tcPr>
+          <w:p>
+            <w:r>
+              <w:t>20.9</w:t>
+            </w:r>
+          </w:p>
+        </w:tc>
+        <w:tc>
+          <w:tcPr>
+            <w:tcW w:type="dxa" w:w="1234"/>
+          </w:tcPr>
+          <w:p>
+            <w:r>
+              <w:t>23.39</w:t>
+            </w:r>
+          </w:p>
+        </w:tc>
+      </w:tr>
+      <w:tr>
+        <w:tc>
+          <w:tcPr>
+            <w:tcW w:type="dxa" w:w="1234"/>
+          </w:tcPr>
+          <w:p>
+            <w:r>
+              <w:t>Mammogram</w:t>
+            </w:r>
+          </w:p>
+        </w:tc>
+        <w:tc>
+          <w:tcPr>
+            <w:tcW w:type="dxa" w:w="1234"/>
+          </w:tcPr>
+          <w:p>
+            <w:r>
+              <w:t>5.465</w:t>
+            </w:r>
+          </w:p>
+        </w:tc>
+        <w:tc>
+          <w:tcPr>
+            <w:tcW w:type="dxa" w:w="1234"/>
+          </w:tcPr>
+          <w:p>
+            <w:r>
+              <w:t>3.332</w:t>
+            </w:r>
+          </w:p>
+        </w:tc>
+        <w:tc>
+          <w:tcPr>
+            <w:tcW w:type="dxa" w:w="1234"/>
+          </w:tcPr>
+          <w:p>
+            <w:r>
+              <w:t>2.133</w:t>
+            </w:r>
+          </w:p>
+        </w:tc>
+        <w:tc>
+          <w:tcPr>
+            <w:tcW w:type="dxa" w:w="1234"/>
+          </w:tcPr>
+          <w:p>
+            <w:r>
+              <w:t>3.346</w:t>
+            </w:r>
+          </w:p>
+        </w:tc>
+        <w:tc>
+          <w:tcPr>
+            <w:tcW w:type="dxa" w:w="1234"/>
+          </w:tcPr>
+          <w:p>
+            <w:r>
+              <w:t>44.2</w:t>
+            </w:r>
+          </w:p>
+        </w:tc>
+        <w:tc>
+          <w:tcPr>
+            <w:tcW w:type="dxa" w:w="1234"/>
+          </w:tcPr>
+          <w:p>
+            <w:r>
+              <w:t>31.56</w:t>
+            </w:r>
+          </w:p>
+        </w:tc>
+      </w:tr>
+      <w:tr>
+        <w:tc>
+          <w:tcPr>
+            <w:tcW w:type="dxa" w:w="1234"/>
+          </w:tcPr>
+          <w:p>
+            <w:r>
+              <w:t>Lung CT</w:t>
+            </w:r>
+          </w:p>
+        </w:tc>
+        <w:tc>
+          <w:tcPr>
+            <w:tcW w:type="dxa" w:w="1234"/>
+          </w:tcPr>
+          <w:p>
+            <w:r>
+              <w:t>4.581</w:t>
+            </w:r>
+          </w:p>
+        </w:tc>
+        <w:tc>
+          <w:tcPr>
+            <w:tcW w:type="dxa" w:w="1234"/>
+          </w:tcPr>
+          <w:p>
+            <w:r>
+              <w:t>4.394</w:t>
+            </w:r>
+          </w:p>
+        </w:tc>
+        <w:tc>
+          <w:tcPr>
+            <w:tcW w:type="dxa" w:w="1234"/>
+          </w:tcPr>
+          <w:p>
+            <w:r>
+              <w:t>0.187</w:t>
+            </w:r>
+          </w:p>
+        </w:tc>
+        <w:tc>
+          <w:tcPr>
+            <w:tcW w:type="dxa" w:w="1234"/>
+          </w:tcPr>
+          <w:p>
+            <w:r>
+              <w:t>4.463</w:t>
+            </w:r>
+          </w:p>
+        </w:tc>
+        <w:tc>
+          <w:tcPr>
+            <w:tcW w:type="dxa" w:w="1234"/>
+          </w:tcPr>
+          <w:p>
+            <w:r>
+              <w:t>25.6</w:t>
+            </w:r>
+          </w:p>
+        </w:tc>
+        <w:tc>
+          <w:tcPr>
+            <w:tcW w:type="dxa" w:w="1234"/>
+          </w:tcPr>
+          <w:p>
+            <w:r>
+              <w:t>24.63</w:t>
+            </w:r>
+          </w:p>
+        </w:tc>
+      </w:tr>
+      <w:tr>
+        <w:tc>
+          <w:tcPr>
+            <w:tcW w:type="dxa" w:w="1234"/>
+          </w:tcPr>
+          <w:p>
+            <w:r>
+              <w:t>Brain MRI</w:t>
+            </w:r>
+          </w:p>
+        </w:tc>
+        <w:tc>
+          <w:tcPr>
+            <w:tcW w:type="dxa" w:w="1234"/>
+          </w:tcPr>
+          <w:p>
+            <w:r>
+              <w:t>4.084</w:t>
+            </w:r>
+          </w:p>
+        </w:tc>
+        <w:tc>
+          <w:tcPr>
+            <w:tcW w:type="dxa" w:w="1234"/>
+          </w:tcPr>
+          <w:p>
+            <w:r>
+              <w:t>3.018</w:t>
+            </w:r>
+          </w:p>
+        </w:tc>
+        <w:tc>
+          <w:tcPr>
+            <w:tcW w:type="dxa" w:w="1234"/>
+          </w:tcPr>
+          <w:p>
+            <w:r>
+              <w:t>1.066</w:t>
+            </w:r>
+          </w:p>
+        </w:tc>
+        <w:tc>
+          <w:tcPr>
+            <w:tcW w:type="dxa" w:w="1234"/>
+          </w:tcPr>
+          <w:p>
+            <w:r>
+              <w:t>3.084</w:t>
+            </w:r>
+          </w:p>
+        </w:tc>
+        <w:tc>
+          <w:tcPr>
+            <w:tcW w:type="dxa" w:w="1234"/>
+          </w:tcPr>
+          <w:p>
+            <w:r>
+              <w:t>48.6</w:t>
+            </w:r>
+          </w:p>
+        </w:tc>
+        <w:tc>
+          <w:tcPr>
+            <w:tcW w:type="dxa" w:w="1234"/>
+          </w:tcPr>
+          <w:p>
+            <w:r>
+              <w:t>33.49</w:t>
             </w:r>
           </w:p>
         </w:tc>

</xml_diff>

<commit_message>
Remove capacity-model paragraph from generated Chapter 4 text (not defined in Chapter 3)
Co-Authored-By: Claude Sonnet 5.5 <noreply@anthropic.com>
Claude-Session: https://claude.ai/code/session_01T6gEewJ8YaCdmnsfS34RJd
</commit_message>
<xml_diff>
--- a/results/CH4_TABLES.docx
+++ b/results/CH4_TABLES.docx
@@ -7546,15 +7546,6 @@
           <w:i w:val="0"/>
         </w:rPr>
         <w:t>The Adaptive strategy also reduced the total execution time for all twelve images at every P ≥ 8. The mean gain was 15.2% at P = 8, 11.8% at P = 10, 8.8% at P = 12, and 6.8% at P = 14. The gain was larger for the color images than for the grayscale images (Table 4.14), in line with the larger share of LBG in their sequential time (Section 4.4). The reduction in total time was close to the reduction in LBG time in absolute terms. At P = 8, the mean reduction for the grayscale images was 14.5 ms in total time and 15.7 ms in LBG time. At P = 14, it was 4.4 ms and 5.4 ms. For the color images, the corresponding values were 46.8 ms and 48.0 ms at P = 8, and 17.0 ms and 17.5 ms at P = 14. The difference between the two reductions was 1.2 ms and 1.0 ms for the grayscale images and 1.3 ms and 0.6 ms for the color images at P = 8 and P = 14, which gives an indicative upper bound for the calibration cost, limited by the 1 ms resolution of the total time. The calibration cost was therefore small compared with the time saved by the better workload balance.</w:t>
-      </w:r>
-    </w:p>
-    <w:p>
-      <w:r>
-        <w:rPr>
-          <w:b w:val="0"/>
-          <w:i w:val="0"/>
-        </w:rPr>
-        <w:t>A simple capacity model is consistent with this behavior. The calibration measured a throughput of about 275 Mcmp/s for the P-core ranks and about 176.5 Mcmp/s for the E-core ranks, a ratio of r = 0.642. With the Equal strategy, every rank receives N/P vectors, so the slowest (E-core) rank determines the time. With an ideal speed-proportional distribution, the time is proportional to N divided by the sum of the rank speeds. For P &gt; 6, the model gives an adaptive gain of 1 − P·r / (6 + (P − 6)·r). This predicts 29.5%, 25.1%, 21.8%, and 19.3% at P = 8, 10, 12, and 14, against the measured 28.4%, 24.1%, 20.1%, and 16.6%. The model overestimates the gain by 1.0 to 2.7 percentage points, which is expected because it ignores communication and fixed costs. The model also predicts that the Equal strategy becomes about 17% slower from P = 6 to P = 8, whereas about 20% was observed. The value of r was taken from the calibration, and it was not fitted to the timing results.</w:t>
       </w:r>
     </w:p>
     <w:p>

</xml_diff>

<commit_message>
Add correctness results (12 images x 4 configurations) and section 4.8 text
Co-Authored-By: Claude Sonnet 5.5 <noreply@anthropic.com>
Claude-Session: https://claude.ai/code/session_01T6gEewJ8YaCdmnsfS34RJd
</commit_message>
<xml_diff>
--- a/results/CH4_TABLES.docx
+++ b/results/CH4_TABLES.docx
@@ -9146,6 +9146,618 @@
           <w:p>
             <w:r>
               <w:t>33.49</w:t>
+            </w:r>
+          </w:p>
+        </w:tc>
+      </w:tr>
+    </w:tbl>
+    <w:p/>
+    <w:p>
+      <w:pPr>
+        <w:pStyle w:val="Heading1"/>
+      </w:pPr>
+      <w:r>
+        <w:t>4.8 Correctness of the Parallel Implementation</w:t>
+      </w:r>
+    </w:p>
+    <w:p>
+      <w:r>
+        <w:rPr>
+          <w:b w:val="0"/>
+          <w:i w:val="0"/>
+        </w:rPr>
+        <w:t>This section verifies that the parallel implementation produces the same compression result as the sequential implementation. Each of the twelve images was processed with four configurations: the sequential program, the parallel program with P = 4 (Equal distribution, the default), the parallel program with P = 14 (Adaptive distribution, the default), and the parallel program with P = 14 and the Equal distribution forced. For each run, the compression ratio, MSE, PSNR, SSIM, the number of LBG iterations, and the reconstructed image were compared. The reconstructed images were compared through their MD5 checksums. The values are deterministic for a fixed input, so each case was run once.</w:t>
+      </w:r>
+    </w:p>
+    <w:p>
+      <w:r>
+        <w:rPr>
+          <w:b w:val="0"/>
+          <w:i w:val="0"/>
+        </w:rPr>
+        <w:t>All 48 runs (12 images × 4 configurations) gave identical values of the five quantities, and the reconstructed images were byte-identical. The values are those of Tables 4.3 and 4.4. The result held when the training vectors were distributed unequally (Adaptive strategy, P = 14). The number of LBG iterations was also identical to the sequential value in every run of the timing campaign (12 images × 7 process counts), so the speedups of Section 4.5 refer to the same computation as the sequential baseline.</w:t>
+      </w:r>
+    </w:p>
+    <w:p>
+      <w:r>
+        <w:rPr>
+          <w:b w:val="0"/>
+          <w:i w:val="0"/>
+        </w:rPr>
+        <w:t>This identity depends on how the sums of the codebook update are accumulated. In an earlier version of the code, which accumulated these sums in single precision, the number of LBG iterations differed between the sequential and the parallel runs and between process counts. The reason is that floating-point addition is not associative, so the order of the partial sums changes the result. The final version accumulates the sums in double precision, and the training vectors are integers, so the sums do not depend on the order of the additions in this experiment.</w:t>
+      </w:r>
+    </w:p>
+    <w:p>
+      <w:r>
+        <w:rPr>
+          <w:b w:val="0"/>
+          <w:i w:val="0"/>
+        </w:rPr>
+        <w:t>The check covers P = 4 and P = 14 for the quality values and the reconstructed image, and all process counts for the iteration count. The check was done on one machine with one compiler and one MPI library.</w:t>
+      </w:r>
+    </w:p>
+    <w:p>
+      <w:r>
+        <w:rPr>
+          <w:b/>
+        </w:rPr>
+        <w:t>Table 4.18. Sequential versus parallel results (P = 4 and P = 14, Equal and Adaptive distribution).</w:t>
+      </w:r>
+    </w:p>
+    <w:tbl>
+      <w:tblPr>
+        <w:tblStyle w:val="TableGrid"/>
+        <w:tblW w:type="auto" w:w="0"/>
+        <w:tblLook w:firstColumn="1" w:firstRow="1" w:lastColumn="0" w:lastRow="0" w:noHBand="0" w:noVBand="1" w:val="04A0"/>
+      </w:tblPr>
+      <w:tblGrid>
+        <w:gridCol w:w="2160"/>
+        <w:gridCol w:w="2160"/>
+        <w:gridCol w:w="2160"/>
+        <w:gridCol w:w="2160"/>
+      </w:tblGrid>
+      <w:tr>
+        <w:tc>
+          <w:tcPr>
+            <w:tcW w:type="dxa" w:w="2160"/>
+          </w:tcPr>
+          <w:p>
+            <w:r>
+              <w:t>Image</w:t>
+            </w:r>
+          </w:p>
+        </w:tc>
+        <w:tc>
+          <w:tcPr>
+            <w:tcW w:type="dxa" w:w="2160"/>
+          </w:tcPr>
+          <w:p>
+            <w:r>
+              <w:t>LBG iterations</w:t>
+            </w:r>
+          </w:p>
+        </w:tc>
+        <w:tc>
+          <w:tcPr>
+            <w:tcW w:type="dxa" w:w="2160"/>
+          </w:tcPr>
+          <w:p>
+            <w:r>
+              <w:t>CR, MSE, PSNR, SSIM, and iterations identical</w:t>
+            </w:r>
+          </w:p>
+        </w:tc>
+        <w:tc>
+          <w:tcPr>
+            <w:tcW w:type="dxa" w:w="2160"/>
+          </w:tcPr>
+          <w:p>
+            <w:r>
+              <w:t>Reconstructed image identical (MD5)</w:t>
+            </w:r>
+          </w:p>
+        </w:tc>
+      </w:tr>
+      <w:tr>
+        <w:tc>
+          <w:tcPr>
+            <w:tcW w:type="dxa" w:w="2160"/>
+          </w:tcPr>
+          <w:p>
+            <w:r>
+              <w:t>Lena</w:t>
+            </w:r>
+          </w:p>
+        </w:tc>
+        <w:tc>
+          <w:tcPr>
+            <w:tcW w:type="dxa" w:w="2160"/>
+          </w:tcPr>
+          <w:p>
+            <w:r>
+              <w:t>160</w:t>
+            </w:r>
+          </w:p>
+        </w:tc>
+        <w:tc>
+          <w:tcPr>
+            <w:tcW w:type="dxa" w:w="2160"/>
+          </w:tcPr>
+          <w:p>
+            <w:r>
+              <w:t>Yes</w:t>
+            </w:r>
+          </w:p>
+        </w:tc>
+        <w:tc>
+          <w:tcPr>
+            <w:tcW w:type="dxa" w:w="2160"/>
+          </w:tcPr>
+          <w:p>
+            <w:r>
+              <w:t>Yes</w:t>
+            </w:r>
+          </w:p>
+        </w:tc>
+      </w:tr>
+      <w:tr>
+        <w:tc>
+          <w:tcPr>
+            <w:tcW w:type="dxa" w:w="2160"/>
+          </w:tcPr>
+          <w:p>
+            <w:r>
+              <w:t>Boat</w:t>
+            </w:r>
+          </w:p>
+        </w:tc>
+        <w:tc>
+          <w:tcPr>
+            <w:tcW w:type="dxa" w:w="2160"/>
+          </w:tcPr>
+          <w:p>
+            <w:r>
+              <w:t>151</w:t>
+            </w:r>
+          </w:p>
+        </w:tc>
+        <w:tc>
+          <w:tcPr>
+            <w:tcW w:type="dxa" w:w="2160"/>
+          </w:tcPr>
+          <w:p>
+            <w:r>
+              <w:t>Yes</w:t>
+            </w:r>
+          </w:p>
+        </w:tc>
+        <w:tc>
+          <w:tcPr>
+            <w:tcW w:type="dxa" w:w="2160"/>
+          </w:tcPr>
+          <w:p>
+            <w:r>
+              <w:t>Yes</w:t>
+            </w:r>
+          </w:p>
+        </w:tc>
+      </w:tr>
+      <w:tr>
+        <w:tc>
+          <w:tcPr>
+            <w:tcW w:type="dxa" w:w="2160"/>
+          </w:tcPr>
+          <w:p>
+            <w:r>
+              <w:t>Cameraman</w:t>
+            </w:r>
+          </w:p>
+        </w:tc>
+        <w:tc>
+          <w:tcPr>
+            <w:tcW w:type="dxa" w:w="2160"/>
+          </w:tcPr>
+          <w:p>
+            <w:r>
+              <w:t>155</w:t>
+            </w:r>
+          </w:p>
+        </w:tc>
+        <w:tc>
+          <w:tcPr>
+            <w:tcW w:type="dxa" w:w="2160"/>
+          </w:tcPr>
+          <w:p>
+            <w:r>
+              <w:t>Yes</w:t>
+            </w:r>
+          </w:p>
+        </w:tc>
+        <w:tc>
+          <w:tcPr>
+            <w:tcW w:type="dxa" w:w="2160"/>
+          </w:tcPr>
+          <w:p>
+            <w:r>
+              <w:t>Yes</w:t>
+            </w:r>
+          </w:p>
+        </w:tc>
+      </w:tr>
+      <w:tr>
+        <w:tc>
+          <w:tcPr>
+            <w:tcW w:type="dxa" w:w="2160"/>
+          </w:tcPr>
+          <w:p>
+            <w:r>
+              <w:t>Peppers</w:t>
+            </w:r>
+          </w:p>
+        </w:tc>
+        <w:tc>
+          <w:tcPr>
+            <w:tcW w:type="dxa" w:w="2160"/>
+          </w:tcPr>
+          <w:p>
+            <w:r>
+              <w:t>132</w:t>
+            </w:r>
+          </w:p>
+        </w:tc>
+        <w:tc>
+          <w:tcPr>
+            <w:tcW w:type="dxa" w:w="2160"/>
+          </w:tcPr>
+          <w:p>
+            <w:r>
+              <w:t>Yes</w:t>
+            </w:r>
+          </w:p>
+        </w:tc>
+        <w:tc>
+          <w:tcPr>
+            <w:tcW w:type="dxa" w:w="2160"/>
+          </w:tcPr>
+          <w:p>
+            <w:r>
+              <w:t>Yes</w:t>
+            </w:r>
+          </w:p>
+        </w:tc>
+      </w:tr>
+      <w:tr>
+        <w:tc>
+          <w:tcPr>
+            <w:tcW w:type="dxa" w:w="2160"/>
+          </w:tcPr>
+          <w:p>
+            <w:r>
+              <w:t>Chest X-ray</w:t>
+            </w:r>
+          </w:p>
+        </w:tc>
+        <w:tc>
+          <w:tcPr>
+            <w:tcW w:type="dxa" w:w="2160"/>
+          </w:tcPr>
+          <w:p>
+            <w:r>
+              <w:t>125</w:t>
+            </w:r>
+          </w:p>
+        </w:tc>
+        <w:tc>
+          <w:tcPr>
+            <w:tcW w:type="dxa" w:w="2160"/>
+          </w:tcPr>
+          <w:p>
+            <w:r>
+              <w:t>Yes</w:t>
+            </w:r>
+          </w:p>
+        </w:tc>
+        <w:tc>
+          <w:tcPr>
+            <w:tcW w:type="dxa" w:w="2160"/>
+          </w:tcPr>
+          <w:p>
+            <w:r>
+              <w:t>Yes</w:t>
+            </w:r>
+          </w:p>
+        </w:tc>
+      </w:tr>
+      <w:tr>
+        <w:tc>
+          <w:tcPr>
+            <w:tcW w:type="dxa" w:w="2160"/>
+          </w:tcPr>
+          <w:p>
+            <w:r>
+              <w:t>Mammogram</w:t>
+            </w:r>
+          </w:p>
+        </w:tc>
+        <w:tc>
+          <w:tcPr>
+            <w:tcW w:type="dxa" w:w="2160"/>
+          </w:tcPr>
+          <w:p>
+            <w:r>
+              <w:t>98</w:t>
+            </w:r>
+          </w:p>
+        </w:tc>
+        <w:tc>
+          <w:tcPr>
+            <w:tcW w:type="dxa" w:w="2160"/>
+          </w:tcPr>
+          <w:p>
+            <w:r>
+              <w:t>Yes</w:t>
+            </w:r>
+          </w:p>
+        </w:tc>
+        <w:tc>
+          <w:tcPr>
+            <w:tcW w:type="dxa" w:w="2160"/>
+          </w:tcPr>
+          <w:p>
+            <w:r>
+              <w:t>Yes</w:t>
+            </w:r>
+          </w:p>
+        </w:tc>
+      </w:tr>
+      <w:tr>
+        <w:tc>
+          <w:tcPr>
+            <w:tcW w:type="dxa" w:w="2160"/>
+          </w:tcPr>
+          <w:p>
+            <w:r>
+              <w:t>Lung CT</w:t>
+            </w:r>
+          </w:p>
+        </w:tc>
+        <w:tc>
+          <w:tcPr>
+            <w:tcW w:type="dxa" w:w="2160"/>
+          </w:tcPr>
+          <w:p>
+            <w:r>
+              <w:t>197</w:t>
+            </w:r>
+          </w:p>
+        </w:tc>
+        <w:tc>
+          <w:tcPr>
+            <w:tcW w:type="dxa" w:w="2160"/>
+          </w:tcPr>
+          <w:p>
+            <w:r>
+              <w:t>Yes</w:t>
+            </w:r>
+          </w:p>
+        </w:tc>
+        <w:tc>
+          <w:tcPr>
+            <w:tcW w:type="dxa" w:w="2160"/>
+          </w:tcPr>
+          <w:p>
+            <w:r>
+              <w:t>Yes</w:t>
+            </w:r>
+          </w:p>
+        </w:tc>
+      </w:tr>
+      <w:tr>
+        <w:tc>
+          <w:tcPr>
+            <w:tcW w:type="dxa" w:w="2160"/>
+          </w:tcPr>
+          <w:p>
+            <w:r>
+              <w:t>Brain MRI</w:t>
+            </w:r>
+          </w:p>
+        </w:tc>
+        <w:tc>
+          <w:tcPr>
+            <w:tcW w:type="dxa" w:w="2160"/>
+          </w:tcPr>
+          <w:p>
+            <w:r>
+              <w:t>142</w:t>
+            </w:r>
+          </w:p>
+        </w:tc>
+        <w:tc>
+          <w:tcPr>
+            <w:tcW w:type="dxa" w:w="2160"/>
+          </w:tcPr>
+          <w:p>
+            <w:r>
+              <w:t>Yes</w:t>
+            </w:r>
+          </w:p>
+        </w:tc>
+        <w:tc>
+          <w:tcPr>
+            <w:tcW w:type="dxa" w:w="2160"/>
+          </w:tcPr>
+          <w:p>
+            <w:r>
+              <w:t>Yes</w:t>
+            </w:r>
+          </w:p>
+        </w:tc>
+      </w:tr>
+      <w:tr>
+        <w:tc>
+          <w:tcPr>
+            <w:tcW w:type="dxa" w:w="2160"/>
+          </w:tcPr>
+          <w:p>
+            <w:r>
+              <w:t>Color Lena</w:t>
+            </w:r>
+          </w:p>
+        </w:tc>
+        <w:tc>
+          <w:tcPr>
+            <w:tcW w:type="dxa" w:w="2160"/>
+          </w:tcPr>
+          <w:p>
+            <w:r>
+              <w:t>476</w:t>
+            </w:r>
+          </w:p>
+        </w:tc>
+        <w:tc>
+          <w:tcPr>
+            <w:tcW w:type="dxa" w:w="2160"/>
+          </w:tcPr>
+          <w:p>
+            <w:r>
+              <w:t>Yes</w:t>
+            </w:r>
+          </w:p>
+        </w:tc>
+        <w:tc>
+          <w:tcPr>
+            <w:tcW w:type="dxa" w:w="2160"/>
+          </w:tcPr>
+          <w:p>
+            <w:r>
+              <w:t>Yes</w:t>
+            </w:r>
+          </w:p>
+        </w:tc>
+      </w:tr>
+      <w:tr>
+        <w:tc>
+          <w:tcPr>
+            <w:tcW w:type="dxa" w:w="2160"/>
+          </w:tcPr>
+          <w:p>
+            <w:r>
+              <w:t>Retinal fundus</w:t>
+            </w:r>
+          </w:p>
+        </w:tc>
+        <w:tc>
+          <w:tcPr>
+            <w:tcW w:type="dxa" w:w="2160"/>
+          </w:tcPr>
+          <w:p>
+            <w:r>
+              <w:t>493</w:t>
+            </w:r>
+          </w:p>
+        </w:tc>
+        <w:tc>
+          <w:tcPr>
+            <w:tcW w:type="dxa" w:w="2160"/>
+          </w:tcPr>
+          <w:p>
+            <w:r>
+              <w:t>Yes</w:t>
+            </w:r>
+          </w:p>
+        </w:tc>
+        <w:tc>
+          <w:tcPr>
+            <w:tcW w:type="dxa" w:w="2160"/>
+          </w:tcPr>
+          <w:p>
+            <w:r>
+              <w:t>Yes</w:t>
+            </w:r>
+          </w:p>
+        </w:tc>
+      </w:tr>
+      <w:tr>
+        <w:tc>
+          <w:tcPr>
+            <w:tcW w:type="dxa" w:w="2160"/>
+          </w:tcPr>
+          <w:p>
+            <w:r>
+              <w:t>Brain axial</w:t>
+            </w:r>
+          </w:p>
+        </w:tc>
+        <w:tc>
+          <w:tcPr>
+            <w:tcW w:type="dxa" w:w="2160"/>
+          </w:tcPr>
+          <w:p>
+            <w:r>
+              <w:t>495</w:t>
+            </w:r>
+          </w:p>
+        </w:tc>
+        <w:tc>
+          <w:tcPr>
+            <w:tcW w:type="dxa" w:w="2160"/>
+          </w:tcPr>
+          <w:p>
+            <w:r>
+              <w:t>Yes</w:t>
+            </w:r>
+          </w:p>
+        </w:tc>
+        <w:tc>
+          <w:tcPr>
+            <w:tcW w:type="dxa" w:w="2160"/>
+          </w:tcPr>
+          <w:p>
+            <w:r>
+              <w:t>Yes</w:t>
+            </w:r>
+          </w:p>
+        </w:tc>
+      </w:tr>
+      <w:tr>
+        <w:tc>
+          <w:tcPr>
+            <w:tcW w:type="dxa" w:w="2160"/>
+          </w:tcPr>
+          <w:p>
+            <w:r>
+              <w:t>Brain sagittal</w:t>
+            </w:r>
+          </w:p>
+        </w:tc>
+        <w:tc>
+          <w:tcPr>
+            <w:tcW w:type="dxa" w:w="2160"/>
+          </w:tcPr>
+          <w:p>
+            <w:r>
+              <w:t>502</w:t>
+            </w:r>
+          </w:p>
+        </w:tc>
+        <w:tc>
+          <w:tcPr>
+            <w:tcW w:type="dxa" w:w="2160"/>
+          </w:tcPr>
+          <w:p>
+            <w:r>
+              <w:t>Yes</w:t>
+            </w:r>
+          </w:p>
+        </w:tc>
+        <w:tc>
+          <w:tcPr>
+            <w:tcW w:type="dxa" w:w="2160"/>
+          </w:tcPr>
+          <w:p>
+            <w:r>
+              <w:t>Yes</w:t>
             </w:r>
           </w:p>
         </w:tc>

</xml_diff>

<commit_message>
Rewrite section 4.8 text (verification), table to Appendix C
Co-Authored-By: Claude Sonnet 5.5 <noreply@anthropic.com>
Claude-Session: https://claude.ai/code/session_01T6gEewJ8YaCdmnsfS34RJd
</commit_message>
<xml_diff>
--- a/results/CH4_TABLES.docx
+++ b/results/CH4_TABLES.docx
@@ -9166,7 +9166,7 @@
           <w:b w:val="0"/>
           <w:i w:val="0"/>
         </w:rPr>
-        <w:t>This section verifies that the parallel implementation produces the same compression result as the sequential implementation. Each of the twelve images was processed with four configurations: the sequential program, the parallel program with P = 4 (Equal distribution, the default), the parallel program with P = 14 (Adaptive distribution, the default), and the parallel program with P = 14 and the Equal distribution forced. For each run, the compression ratio, MSE, PSNR, SSIM, the number of LBG iterations, and the reconstructed image were compared. The reconstructed images were compared through their MD5 checksums. The values are deterministic for a fixed input, so each case was run once.</w:t>
+        <w:t>To verify that the MPI-based implementation preserved the numerical results of the sequential implementation, a separate verification test was performed on all twelve images. Four execution configurations were evaluated for each image: the sequential implementation, the parallel implementation with P = 4, the parallel implementation with P = 14 using the Adaptive strategy, and the parallel implementation with P = 14 using the Equal strategy. The comparison included the compression ratio (CR), MSE, PSNR, SSIM, the number of LBG iterations, and the final reconstructed image. The reconstructed images were additionally compared using their MD5 hashes to verify byte-for-byte equality.</w:t>
       </w:r>
     </w:p>
     <w:p>
@@ -9175,7 +9175,7 @@
           <w:b w:val="0"/>
           <w:i w:val="0"/>
         </w:rPr>
-        <w:t>All 48 runs (12 images × 4 configurations) gave identical values of the five quantities, and the reconstructed images were byte-identical. The values are those of Tables 4.3 and 4.4. The result held when the training vectors were distributed unequally (Adaptive strategy, P = 14). The number of LBG iterations was also identical to the sequential value in every run of the timing campaign (12 images × 7 process counts), so the speedups of Section 4.5 refer to the same computation as the sequential baseline.</w:t>
+        <w:t>All 48 executions produced identical CR, MSE, PSNR, and SSIM values for the corresponding images. The number of LBG iterations was also identical across the compared configurations. In addition, the MD5 hashes of the reconstructed images matched in every case, confirming byte-for-byte equality of the reconstructed outputs under the tested configurations. This result was maintained at P = 14 with the Adaptive strategy, where the workload was distributed unequally among the MPI processes. These results were obtained with the sums of the codebook update accumulated in double precision (Section 3.3). The workload redistribution therefore changed how the computation was divided among the processes without changing the final reconstructed output, and the speedups reported in Section 4.5 refer to the same computation as the sequential baseline. The detailed results for each image are given in Appendix C.</w:t>
       </w:r>
     </w:p>
     <w:p>
@@ -9184,16 +9184,15 @@
           <w:b w:val="0"/>
           <w:i w:val="0"/>
         </w:rPr>
-        <w:t>This identity depends on how the sums of the codebook update are accumulated. In an earlier version of the code, which accumulated these sums in single precision, the number of LBG iterations differed between the sequential and the parallel runs and between process counts. The reason is that floating-point addition is not associative, so the order of the partial sums changes the result. The final version accumulates the sums in double precision, and the training vectors are integers, so the sums do not depend on the order of the additions in this experiment.</w:t>
+        <w:t>The verification covered P = 4 and P = 14 for the quality values and the reconstructed images. The number of LBG iterations was also identical to the sequential value at all tested process counts in the timing runs (P = 2, 4, 6, 8, 10, 12, and 14). The codebooks and the compressed bit streams were not compared directly. The test was performed on one machine, with one compiler and one MPI library.</w:t>
       </w:r>
     </w:p>
     <w:p>
+      <w:pPr>
+        <w:pStyle w:val="Heading2"/>
+      </w:pPr>
       <w:r>
-        <w:rPr>
-          <w:b w:val="0"/>
-          <w:i w:val="0"/>
-        </w:rPr>
-        <w:t>The check covers P = 4 and P = 14 for the quality values and the reconstructed image, and all process counts for the iteration count. The check was done on one machine with one compiler and one MPI library.</w:t>
+        <w:t>Appendix C (per-image verification table)</w:t>
       </w:r>
     </w:p>
     <w:p>

</xml_diff>

<commit_message>
Add chapter 4 summary (4.9) generated from data
Co-Authored-By: Claude Sonnet 5.5 <noreply@anthropic.com>
Claude-Session: https://claude.ai/code/session_01T6gEewJ8YaCdmnsfS34RJd
</commit_message>
<xml_diff>
--- a/results/CH4_TABLES.docx
+++ b/results/CH4_TABLES.docx
@@ -9185,6 +9185,59 @@
           <w:i w:val="0"/>
         </w:rPr>
         <w:t>The verification covered P = 4 and P = 14 for the quality values and the reconstructed images. The number of LBG iterations was also identical to the sequential value at all tested process counts in the timing runs (P = 2, 4, 6, 8, 10, 12, and 14). The codebooks and the compressed bit streams were not compared directly. The test was performed on one machine, with one compiler and one MPI library.</w:t>
+      </w:r>
+    </w:p>
+    <w:p>
+      <w:pPr>
+        <w:pStyle w:val="Heading1"/>
+      </w:pPr>
+      <w:r>
+        <w:t>4.9 Chapter Summary</w:t>
+      </w:r>
+    </w:p>
+    <w:p>
+      <w:r>
+        <w:rPr>
+          <w:b w:val="0"/>
+          <w:i w:val="0"/>
+        </w:rPr>
+        <w:t>This chapter evaluated the proposed framework on twelve images (eight grayscale and four color) in terms of compression and reconstruction quality, sequential and parallel performance, the effect of the bilateral filter, the comparison of the Equal and Adaptive workload-distribution strategies, and the agreement between the sequential and the parallel results.</w:t>
+      </w:r>
+    </w:p>
+    <w:p>
+      <w:r>
+        <w:rPr>
+          <w:b w:val="0"/>
+          <w:i w:val="0"/>
+        </w:rPr>
+        <w:t>The compression ratio ranged from 23.39 to 33.49 for the grayscale images and from 22.24 to 34.07 for the color images. The PSNR ranged from 28.90 to 36.73 dB and from 28.36 to 40.37 dB, and the SSIM from 0.7875 to 0.9474 and from 0.7733 to 0.9541, respectively. The bilateral post-filter improved the MSE, PSNR, and SSIM of all twelve images, by 0.97 dB in PSNR and 0.0216 in SSIM on average.</w:t>
+      </w:r>
+    </w:p>
+    <w:p>
+      <w:r>
+        <w:rPr>
+          <w:b w:val="0"/>
+          <w:i w:val="0"/>
+        </w:rPr>
+        <w:t>In the sequential implementation, the LBG stage accounted for 71.4% to 79.6% of the total execution time. Its parallelization with MPI gave a mean LBG speedup of 9.12 at P = 14, with a parallel efficiency of 65.1%, and a mean speedup of 4.90 for the total execution time. The LBG speedup was almost the same for all images, and the efficiency decreased after P = 6, where the processes began to run on E-cores.</w:t>
+      </w:r>
+    </w:p>
+    <w:p>
+      <w:r>
+        <w:rPr>
+          <w:b w:val="0"/>
+          <w:i w:val="0"/>
+        </w:rPr>
+        <w:t>The Equal and Adaptive strategies gave the same execution time for P ≤ 6. For P ≥ 8, the Adaptive strategy was faster for all twelve images. It reduced the mean LBG time by 28.4% at P = 8 and by 16.6% at P = 14, and the mean total execution time, which includes the speed calibration, by 15.2% and 6.8%, respectively. The parallel implementation produced the same compression ratio, MSE, PSNR, SSIM, number of LBG iterations, and reconstructed images as the sequential implementation in all verification runs.</w:t>
+      </w:r>
+    </w:p>
+    <w:p>
+      <w:r>
+        <w:rPr>
+          <w:b w:val="0"/>
+          <w:i w:val="0"/>
+        </w:rPr>
+        <w:t>All measurements were made on one hybrid processor with up to 14 MPI processes, and the total execution time was recorded with a resolution of 1 ms. The conclusions and future work are presented in the next chapter.</w:t>
       </w:r>
     </w:p>
     <w:p>

</xml_diff>

<commit_message>
Add parameter table and grayscale/color speedup table for supervisor structure
Co-Authored-By: Claude Sonnet 5.5 <noreply@anthropic.com>
Claude-Session: https://claude.ai/code/session_01T6gEewJ8YaCdmnsfS34RJd
</commit_message>
<xml_diff>
--- a/results/CH4_TABLES.docx
+++ b/results/CH4_TABLES.docx
@@ -9810,6 +9810,841 @@
           <w:p>
             <w:r>
               <w:t>Yes</w:t>
+            </w:r>
+          </w:p>
+        </w:tc>
+      </w:tr>
+    </w:tbl>
+    <w:p/>
+    <w:p>
+      <w:pPr>
+        <w:pStyle w:val="Heading1"/>
+      </w:pPr>
+      <w:r>
+        <w:t>Additional tables for the supervisor structure</w:t>
+      </w:r>
+    </w:p>
+    <w:p>
+      <w:pPr>
+        <w:pStyle w:val="Heading2"/>
+      </w:pPr>
+      <w:r>
+        <w:t>For Performance of Parallel Results (grayscale and color separately)</w:t>
+      </w:r>
+    </w:p>
+    <w:p>
+      <w:r>
+        <w:rPr>
+          <w:b/>
+        </w:rPr>
+        <w:t>Table 4.19. Mean LBG speedup and parallel efficiency of the grayscale and the color images.</w:t>
+      </w:r>
+    </w:p>
+    <w:tbl>
+      <w:tblPr>
+        <w:tblStyle w:val="TableGrid"/>
+        <w:tblW w:type="auto" w:w="0"/>
+        <w:tblLook w:firstColumn="1" w:firstRow="1" w:lastColumn="0" w:lastRow="0" w:noHBand="0" w:noVBand="1" w:val="04A0"/>
+      </w:tblPr>
+      <w:tblGrid>
+        <w:gridCol w:w="1728"/>
+        <w:gridCol w:w="1728"/>
+        <w:gridCol w:w="1728"/>
+        <w:gridCol w:w="1728"/>
+        <w:gridCol w:w="1728"/>
+      </w:tblGrid>
+      <w:tr>
+        <w:tc>
+          <w:tcPr>
+            <w:tcW w:type="dxa" w:w="1728"/>
+          </w:tcPr>
+          <w:p>
+            <w:r>
+              <w:t>P</w:t>
+            </w:r>
+          </w:p>
+        </w:tc>
+        <w:tc>
+          <w:tcPr>
+            <w:tcW w:type="dxa" w:w="1728"/>
+          </w:tcPr>
+          <w:p>
+            <w:r>
+              <w:t>Grayscale: speedup</w:t>
+            </w:r>
+          </w:p>
+        </w:tc>
+        <w:tc>
+          <w:tcPr>
+            <w:tcW w:type="dxa" w:w="1728"/>
+          </w:tcPr>
+          <w:p>
+            <w:r>
+              <w:t>Grayscale: efficiency (%)</w:t>
+            </w:r>
+          </w:p>
+        </w:tc>
+        <w:tc>
+          <w:tcPr>
+            <w:tcW w:type="dxa" w:w="1728"/>
+          </w:tcPr>
+          <w:p>
+            <w:r>
+              <w:t>Color: speedup</w:t>
+            </w:r>
+          </w:p>
+        </w:tc>
+        <w:tc>
+          <w:tcPr>
+            <w:tcW w:type="dxa" w:w="1728"/>
+          </w:tcPr>
+          <w:p>
+            <w:r>
+              <w:t>Color: efficiency (%)</w:t>
+            </w:r>
+          </w:p>
+        </w:tc>
+      </w:tr>
+      <w:tr>
+        <w:tc>
+          <w:tcPr>
+            <w:tcW w:type="dxa" w:w="1728"/>
+          </w:tcPr>
+          <w:p>
+            <w:r>
+              <w:t>2</w:t>
+            </w:r>
+          </w:p>
+        </w:tc>
+        <w:tc>
+          <w:tcPr>
+            <w:tcW w:type="dxa" w:w="1728"/>
+          </w:tcPr>
+          <w:p>
+            <w:r>
+              <w:t>1.92</w:t>
+            </w:r>
+          </w:p>
+        </w:tc>
+        <w:tc>
+          <w:tcPr>
+            <w:tcW w:type="dxa" w:w="1728"/>
+          </w:tcPr>
+          <w:p>
+            <w:r>
+              <w:t>96.1</w:t>
+            </w:r>
+          </w:p>
+        </w:tc>
+        <w:tc>
+          <w:tcPr>
+            <w:tcW w:type="dxa" w:w="1728"/>
+          </w:tcPr>
+          <w:p>
+            <w:r>
+              <w:t>1.92</w:t>
+            </w:r>
+          </w:p>
+        </w:tc>
+        <w:tc>
+          <w:tcPr>
+            <w:tcW w:type="dxa" w:w="1728"/>
+          </w:tcPr>
+          <w:p>
+            <w:r>
+              <w:t>95.9</w:t>
+            </w:r>
+          </w:p>
+        </w:tc>
+      </w:tr>
+      <w:tr>
+        <w:tc>
+          <w:tcPr>
+            <w:tcW w:type="dxa" w:w="1728"/>
+          </w:tcPr>
+          <w:p>
+            <w:r>
+              <w:t>4</w:t>
+            </w:r>
+          </w:p>
+        </w:tc>
+        <w:tc>
+          <w:tcPr>
+            <w:tcW w:type="dxa" w:w="1728"/>
+          </w:tcPr>
+          <w:p>
+            <w:r>
+              <w:t>3.75</w:t>
+            </w:r>
+          </w:p>
+        </w:tc>
+        <w:tc>
+          <w:tcPr>
+            <w:tcW w:type="dxa" w:w="1728"/>
+          </w:tcPr>
+          <w:p>
+            <w:r>
+              <w:t>93.8</w:t>
+            </w:r>
+          </w:p>
+        </w:tc>
+        <w:tc>
+          <w:tcPr>
+            <w:tcW w:type="dxa" w:w="1728"/>
+          </w:tcPr>
+          <w:p>
+            <w:r>
+              <w:t>3.77</w:t>
+            </w:r>
+          </w:p>
+        </w:tc>
+        <w:tc>
+          <w:tcPr>
+            <w:tcW w:type="dxa" w:w="1728"/>
+          </w:tcPr>
+          <w:p>
+            <w:r>
+              <w:t>94.3</w:t>
+            </w:r>
+          </w:p>
+        </w:tc>
+      </w:tr>
+      <w:tr>
+        <w:tc>
+          <w:tcPr>
+            <w:tcW w:type="dxa" w:w="1728"/>
+          </w:tcPr>
+          <w:p>
+            <w:r>
+              <w:t>6</w:t>
+            </w:r>
+          </w:p>
+        </w:tc>
+        <w:tc>
+          <w:tcPr>
+            <w:tcW w:type="dxa" w:w="1728"/>
+          </w:tcPr>
+          <w:p>
+            <w:r>
+              <w:t>5.37</w:t>
+            </w:r>
+          </w:p>
+        </w:tc>
+        <w:tc>
+          <w:tcPr>
+            <w:tcW w:type="dxa" w:w="1728"/>
+          </w:tcPr>
+          <w:p>
+            <w:r>
+              <w:t>89.5</w:t>
+            </w:r>
+          </w:p>
+        </w:tc>
+        <w:tc>
+          <w:tcPr>
+            <w:tcW w:type="dxa" w:w="1728"/>
+          </w:tcPr>
+          <w:p>
+            <w:r>
+              <w:t>5.36</w:t>
+            </w:r>
+          </w:p>
+        </w:tc>
+        <w:tc>
+          <w:tcPr>
+            <w:tcW w:type="dxa" w:w="1728"/>
+          </w:tcPr>
+          <w:p>
+            <w:r>
+              <w:t>89.3</w:t>
+            </w:r>
+          </w:p>
+        </w:tc>
+      </w:tr>
+      <w:tr>
+        <w:tc>
+          <w:tcPr>
+            <w:tcW w:type="dxa" w:w="1728"/>
+          </w:tcPr>
+          <w:p>
+            <w:r>
+              <w:t>8</w:t>
+            </w:r>
+          </w:p>
+        </w:tc>
+        <w:tc>
+          <w:tcPr>
+            <w:tcW w:type="dxa" w:w="1728"/>
+          </w:tcPr>
+          <w:p>
+            <w:r>
+              <w:t>6.28</w:t>
+            </w:r>
+          </w:p>
+        </w:tc>
+        <w:tc>
+          <w:tcPr>
+            <w:tcW w:type="dxa" w:w="1728"/>
+          </w:tcPr>
+          <w:p>
+            <w:r>
+              <w:t>78.5</w:t>
+            </w:r>
+          </w:p>
+        </w:tc>
+        <w:tc>
+          <w:tcPr>
+            <w:tcW w:type="dxa" w:w="1728"/>
+          </w:tcPr>
+          <w:p>
+            <w:r>
+              <w:t>6.26</w:t>
+            </w:r>
+          </w:p>
+        </w:tc>
+        <w:tc>
+          <w:tcPr>
+            <w:tcW w:type="dxa" w:w="1728"/>
+          </w:tcPr>
+          <w:p>
+            <w:r>
+              <w:t>78.3</w:t>
+            </w:r>
+          </w:p>
+        </w:tc>
+      </w:tr>
+      <w:tr>
+        <w:tc>
+          <w:tcPr>
+            <w:tcW w:type="dxa" w:w="1728"/>
+          </w:tcPr>
+          <w:p>
+            <w:r>
+              <w:t>10</w:t>
+            </w:r>
+          </w:p>
+        </w:tc>
+        <w:tc>
+          <w:tcPr>
+            <w:tcW w:type="dxa" w:w="1728"/>
+          </w:tcPr>
+          <w:p>
+            <w:r>
+              <w:t>7.32</w:t>
+            </w:r>
+          </w:p>
+        </w:tc>
+        <w:tc>
+          <w:tcPr>
+            <w:tcW w:type="dxa" w:w="1728"/>
+          </w:tcPr>
+          <w:p>
+            <w:r>
+              <w:t>73.2</w:t>
+            </w:r>
+          </w:p>
+        </w:tc>
+        <w:tc>
+          <w:tcPr>
+            <w:tcW w:type="dxa" w:w="1728"/>
+          </w:tcPr>
+          <w:p>
+            <w:r>
+              <w:t>7.31</w:t>
+            </w:r>
+          </w:p>
+        </w:tc>
+        <w:tc>
+          <w:tcPr>
+            <w:tcW w:type="dxa" w:w="1728"/>
+          </w:tcPr>
+          <w:p>
+            <w:r>
+              <w:t>73.1</w:t>
+            </w:r>
+          </w:p>
+        </w:tc>
+      </w:tr>
+      <w:tr>
+        <w:tc>
+          <w:tcPr>
+            <w:tcW w:type="dxa" w:w="1728"/>
+          </w:tcPr>
+          <w:p>
+            <w:r>
+              <w:t>12</w:t>
+            </w:r>
+          </w:p>
+        </w:tc>
+        <w:tc>
+          <w:tcPr>
+            <w:tcW w:type="dxa" w:w="1728"/>
+          </w:tcPr>
+          <w:p>
+            <w:r>
+              <w:t>8.18</w:t>
+            </w:r>
+          </w:p>
+        </w:tc>
+        <w:tc>
+          <w:tcPr>
+            <w:tcW w:type="dxa" w:w="1728"/>
+          </w:tcPr>
+          <w:p>
+            <w:r>
+              <w:t>68.2</w:t>
+            </w:r>
+          </w:p>
+        </w:tc>
+        <w:tc>
+          <w:tcPr>
+            <w:tcW w:type="dxa" w:w="1728"/>
+          </w:tcPr>
+          <w:p>
+            <w:r>
+              <w:t>8.18</w:t>
+            </w:r>
+          </w:p>
+        </w:tc>
+        <w:tc>
+          <w:tcPr>
+            <w:tcW w:type="dxa" w:w="1728"/>
+          </w:tcPr>
+          <w:p>
+            <w:r>
+              <w:t>68.2</w:t>
+            </w:r>
+          </w:p>
+        </w:tc>
+      </w:tr>
+      <w:tr>
+        <w:tc>
+          <w:tcPr>
+            <w:tcW w:type="dxa" w:w="1728"/>
+          </w:tcPr>
+          <w:p>
+            <w:r>
+              <w:t>14</w:t>
+            </w:r>
+          </w:p>
+        </w:tc>
+        <w:tc>
+          <w:tcPr>
+            <w:tcW w:type="dxa" w:w="1728"/>
+          </w:tcPr>
+          <w:p>
+            <w:r>
+              <w:t>9.13</w:t>
+            </w:r>
+          </w:p>
+        </w:tc>
+        <w:tc>
+          <w:tcPr>
+            <w:tcW w:type="dxa" w:w="1728"/>
+          </w:tcPr>
+          <w:p>
+            <w:r>
+              <w:t>65.2</w:t>
+            </w:r>
+          </w:p>
+        </w:tc>
+        <w:tc>
+          <w:tcPr>
+            <w:tcW w:type="dxa" w:w="1728"/>
+          </w:tcPr>
+          <w:p>
+            <w:r>
+              <w:t>9.09</w:t>
+            </w:r>
+          </w:p>
+        </w:tc>
+        <w:tc>
+          <w:tcPr>
+            <w:tcW w:type="dxa" w:w="1728"/>
+          </w:tcPr>
+          <w:p>
+            <w:r>
+              <w:t>64.9</w:t>
+            </w:r>
+          </w:p>
+        </w:tc>
+      </w:tr>
+    </w:tbl>
+    <w:p/>
+    <w:p>
+      <w:pPr>
+        <w:pStyle w:val="Heading2"/>
+      </w:pPr>
+      <w:r>
+        <w:t>For Experimental Setting</w:t>
+      </w:r>
+    </w:p>
+    <w:p>
+      <w:r>
+        <w:rPr>
+          <w:b/>
+        </w:rPr>
+        <w:t>Table 4.20. Parameters of the algorithm and of the experiments.</w:t>
+      </w:r>
+    </w:p>
+    <w:tbl>
+      <w:tblPr>
+        <w:tblStyle w:val="TableGrid"/>
+        <w:tblW w:type="auto" w:w="0"/>
+        <w:tblLook w:firstColumn="1" w:firstRow="1" w:lastColumn="0" w:lastRow="0" w:noHBand="0" w:noVBand="1" w:val="04A0"/>
+      </w:tblPr>
+      <w:tblGrid>
+        <w:gridCol w:w="4320"/>
+        <w:gridCol w:w="4320"/>
+      </w:tblGrid>
+      <w:tr>
+        <w:tc>
+          <w:tcPr>
+            <w:tcW w:type="dxa" w:w="4320"/>
+          </w:tcPr>
+          <w:p>
+            <w:r>
+              <w:t>Parameter</w:t>
+            </w:r>
+          </w:p>
+        </w:tc>
+        <w:tc>
+          <w:tcPr>
+            <w:tcW w:type="dxa" w:w="4320"/>
+          </w:tcPr>
+          <w:p>
+            <w:r>
+              <w:t>Value</w:t>
+            </w:r>
+          </w:p>
+        </w:tc>
+      </w:tr>
+      <w:tr>
+        <w:tc>
+          <w:tcPr>
+            <w:tcW w:type="dxa" w:w="4320"/>
+          </w:tcPr>
+          <w:p>
+            <w:r>
+              <w:t>Image size</w:t>
+            </w:r>
+          </w:p>
+        </w:tc>
+        <w:tc>
+          <w:tcPr>
+            <w:tcW w:type="dxa" w:w="4320"/>
+          </w:tcPr>
+          <w:p>
+            <w:r>
+              <w:t>512 × 512 pixels, 8 bits per sample</w:t>
+            </w:r>
+          </w:p>
+        </w:tc>
+      </w:tr>
+      <w:tr>
+        <w:tc>
+          <w:tcPr>
+            <w:tcW w:type="dxa" w:w="4320"/>
+          </w:tcPr>
+          <w:p>
+            <w:r>
+              <w:t>Block size / vector dimension</w:t>
+            </w:r>
+          </w:p>
+        </w:tc>
+        <w:tc>
+          <w:tcPr>
+            <w:tcW w:type="dxa" w:w="4320"/>
+          </w:tcPr>
+          <w:p>
+            <w:r>
+              <w:t>4 × 4 pixels / 16</w:t>
+            </w:r>
+          </w:p>
+        </w:tc>
+      </w:tr>
+      <w:tr>
+        <w:tc>
+          <w:tcPr>
+            <w:tcW w:type="dxa" w:w="4320"/>
+          </w:tcPr>
+          <w:p>
+            <w:r>
+              <w:t>Training vectors per channel (N)</w:t>
+            </w:r>
+          </w:p>
+        </w:tc>
+        <w:tc>
+          <w:tcPr>
+            <w:tcW w:type="dxa" w:w="4320"/>
+          </w:tcPr>
+          <w:p>
+            <w:r>
+              <w:t>16,384</w:t>
+            </w:r>
+          </w:p>
+        </w:tc>
+      </w:tr>
+      <w:tr>
+        <w:tc>
+          <w:tcPr>
+            <w:tcW w:type="dxa" w:w="4320"/>
+          </w:tcPr>
+          <w:p>
+            <w:r>
+              <w:t>Codebook size (K)</w:t>
+            </w:r>
+          </w:p>
+        </w:tc>
+        <w:tc>
+          <w:tcPr>
+            <w:tcW w:type="dxa" w:w="4320"/>
+          </w:tcPr>
+          <w:p>
+            <w:r>
+              <w:t>64</w:t>
+            </w:r>
+          </w:p>
+        </w:tc>
+      </w:tr>
+      <w:tr>
+        <w:tc>
+          <w:tcPr>
+            <w:tcW w:type="dxa" w:w="4320"/>
+          </w:tcPr>
+          <w:p>
+            <w:r>
+              <w:t>LBG splitting perturbation (δ)</w:t>
+            </w:r>
+          </w:p>
+        </w:tc>
+        <w:tc>
+          <w:tcPr>
+            <w:tcW w:type="dxa" w:w="4320"/>
+          </w:tcPr>
+          <w:p>
+            <w:r>
+              <w:t>0.01</w:t>
+            </w:r>
+          </w:p>
+        </w:tc>
+      </w:tr>
+      <w:tr>
+        <w:tc>
+          <w:tcPr>
+            <w:tcW w:type="dxa" w:w="4320"/>
+          </w:tcPr>
+          <w:p>
+            <w:r>
+              <w:t>LBG convergence threshold (ε)</w:t>
+            </w:r>
+          </w:p>
+        </w:tc>
+        <w:tc>
+          <w:tcPr>
+            <w:tcW w:type="dxa" w:w="4320"/>
+          </w:tcPr>
+          <w:p>
+            <w:r>
+              <w:t>0.0001 (relative improvement of the distortion)</w:t>
+            </w:r>
+          </w:p>
+        </w:tc>
+      </w:tr>
+      <w:tr>
+        <w:tc>
+          <w:tcPr>
+            <w:tcW w:type="dxa" w:w="4320"/>
+          </w:tcPr>
+          <w:p>
+            <w:r>
+              <w:t>Maximum LBG iterations per codebook size</w:t>
+            </w:r>
+          </w:p>
+        </w:tc>
+        <w:tc>
+          <w:tcPr>
+            <w:tcW w:type="dxa" w:w="4320"/>
+          </w:tcPr>
+          <w:p>
+            <w:r>
+              <w:t>100</w:t>
+            </w:r>
+          </w:p>
+        </w:tc>
+      </w:tr>
+      <w:tr>
+        <w:tc>
+          <w:tcPr>
+            <w:tcW w:type="dxa" w:w="4320"/>
+          </w:tcPr>
+          <w:p>
+            <w:r>
+              <w:t>Delta coding offset</w:t>
+            </w:r>
+          </w:p>
+        </w:tc>
+        <w:tc>
+          <w:tcPr>
+            <w:tcW w:type="dxa" w:w="4320"/>
+          </w:tcPr>
+          <w:p>
+            <w:r>
+              <w:t>128</w:t>
+            </w:r>
+          </w:p>
+        </w:tc>
+      </w:tr>
+      <w:tr>
+        <w:tc>
+          <w:tcPr>
+            <w:tcW w:type="dxa" w:w="4320"/>
+          </w:tcPr>
+          <w:p>
+            <w:r>
+              <w:t>Bilateral filter</w:t>
+            </w:r>
+          </w:p>
+        </w:tc>
+        <w:tc>
+          <w:tcPr>
+            <w:tcW w:type="dxa" w:w="4320"/>
+          </w:tcPr>
+          <w:p>
+            <w:r>
+              <w:t>d = 3, σ_color = 80, σ_space = 5, α = 0.4</w:t>
+            </w:r>
+          </w:p>
+        </w:tc>
+      </w:tr>
+      <w:tr>
+        <w:tc>
+          <w:tcPr>
+            <w:tcW w:type="dxa" w:w="4320"/>
+          </w:tcPr>
+          <w:p>
+            <w:r>
+              <w:t>SSIM</w:t>
+            </w:r>
+          </w:p>
+        </w:tc>
+        <w:tc>
+          <w:tcPr>
+            <w:tcW w:type="dxa" w:w="4320"/>
+          </w:tcPr>
+          <w:p>
+            <w:r>
+              <w:t>11 × 11 Gaussian window, σ = 1.5, K1 = 0.01, K2 = 0.03</w:t>
+            </w:r>
+          </w:p>
+        </w:tc>
+      </w:tr>
+      <w:tr>
+        <w:tc>
+          <w:tcPr>
+            <w:tcW w:type="dxa" w:w="4320"/>
+          </w:tcPr>
+          <w:p>
+            <w:r>
+              <w:t>Color images</w:t>
+            </w:r>
+          </w:p>
+        </w:tc>
+        <w:tc>
+          <w:tcPr>
+            <w:tcW w:type="dxa" w:w="4320"/>
+          </w:tcPr>
+          <w:p>
+            <w:r>
+              <w:t>R, G, and B channels coded independently</w:t>
+            </w:r>
+          </w:p>
+        </w:tc>
+      </w:tr>
+      <w:tr>
+        <w:tc>
+          <w:tcPr>
+            <w:tcW w:type="dxa" w:w="4320"/>
+          </w:tcPr>
+          <w:p>
+            <w:r>
+              <w:t>Accumulation in the codebook update</w:t>
+            </w:r>
+          </w:p>
+        </w:tc>
+        <w:tc>
+          <w:tcPr>
+            <w:tcW w:type="dxa" w:w="4320"/>
+          </w:tcPr>
+          <w:p>
+            <w:r>
+              <w:t>Double precision</w:t>
+            </w:r>
+          </w:p>
+        </w:tc>
+      </w:tr>
+      <w:tr>
+        <w:tc>
+          <w:tcPr>
+            <w:tcW w:type="dxa" w:w="4320"/>
+          </w:tcPr>
+          <w:p>
+            <w:r>
+              <w:t>Default distribution strategy</w:t>
+            </w:r>
+          </w:p>
+        </w:tc>
+        <w:tc>
+          <w:tcPr>
+            <w:tcW w:type="dxa" w:w="4320"/>
+          </w:tcPr>
+          <w:p>
+            <w:r>
+              <w:t>Equal for P ≤ 4, Adaptive for P &gt; 4</w:t>
+            </w:r>
+          </w:p>
+        </w:tc>
+      </w:tr>
+      <w:tr>
+        <w:tc>
+          <w:tcPr>
+            <w:tcW w:type="dxa" w:w="4320"/>
+          </w:tcPr>
+          <w:p>
+            <w:r>
+              <w:t>Speed calibration (Adaptive)</w:t>
+            </w:r>
+          </w:p>
+        </w:tc>
+        <w:tc>
+          <w:tcPr>
+            <w:tcW w:type="dxa" w:w="4320"/>
+          </w:tcPr>
+          <w:p>
+            <w:r>
+              <w:t>3 trials; the first is discarded and the fastest of the others is used</w:t>
+            </w:r>
+          </w:p>
+        </w:tc>
+      </w:tr>
+      <w:tr>
+        <w:tc>
+          <w:tcPr>
+            <w:tcW w:type="dxa" w:w="4320"/>
+          </w:tcPr>
+          <w:p>
+            <w:r>
+              <w:t>Timing</w:t>
+            </w:r>
+          </w:p>
+        </w:tc>
+        <w:tc>
+          <w:tcPr>
+            <w:tcW w:type="dxa" w:w="4320"/>
+          </w:tcPr>
+          <w:p>
+            <w:r>
+              <w:t>Median of 5 runs</w:t>
             </w:r>
           </w:p>
         </w:tc>

</xml_diff>